<commit_message>
Update portal UI and case templates
</commit_message>
<xml_diff>
--- a/templates/Burial Case Study and GL/Burial Case Study-Guarantee Letter.fixed.docx
+++ b/templates/Burial Case Study and GL/Burial Case Study-Guarantee Letter.fixed.docx
@@ -1386,60 +1386,28 @@
         </w:rPr>
         <w:t xml:space="preserve">   </w:t>
       </w:r>
-      <w:r>
-        <w:rPr>
-          <w:b/>
-          <w:bCs/>
+    </w:p>
+    <w:p>
+      <w:pPr>
+        <w:spacing w:after="0"/>
+        <w:rPr>
           <w:sz w:val="10"/>
           <w:szCs w:val="10"/>
         </w:rPr>
-        <w:t>Document URL:</w:t>
-      </w:r>
+      </w:pPr>
       <w:r>
         <w:rPr>
           <w:sz w:val="10"/>
           <w:szCs w:val="10"/>
         </w:rPr>
-        <w:t xml:space="preserve"> {</w:t>
-      </w:r>
-      <w:proofErr w:type="spellStart"/>
+        <w:t xml:space="preserve">   S</w:t>
+      </w:r>
       <w:r>
         <w:rPr>
           <w:sz w:val="10"/>
           <w:szCs w:val="10"/>
         </w:rPr>
-        <w:t>documentVerificationUrl</w:t>
-      </w:r>
-      <w:proofErr w:type="spellEnd"/>
-      <w:r>
-        <w:rPr>
-          <w:sz w:val="10"/>
-          <w:szCs w:val="10"/>
-        </w:rPr>
-        <w:t xml:space="preserve">}   </w:t>
-      </w:r>
-    </w:p>
-    <w:p>
-      <w:pPr>
-        <w:spacing w:after="0"/>
-        <w:rPr>
-          <w:sz w:val="10"/>
-          <w:szCs w:val="10"/>
-        </w:rPr>
-      </w:pPr>
-      <w:r>
-        <w:rPr>
-          <w:sz w:val="10"/>
-          <w:szCs w:val="10"/>
-        </w:rPr>
-        <w:t xml:space="preserve">   S</w:t>
-      </w:r>
-      <w:r>
-        <w:rPr>
-          <w:sz w:val="10"/>
-          <w:szCs w:val="10"/>
-        </w:rPr>
-        <w:t>can the QR code or open the verification link to confirm authenticity.</w:t>
+        <w:t>can the QR code to confirm authenticity.</w:t>
       </w:r>
       <w:r>
         <w:rPr>

</xml_diff>

<commit_message>
chore(templates): update Burial Case Study GL and CGV AICS Word templates
</commit_message>
<xml_diff>
--- a/templates/Burial Case Study and GL/Burial Case Study-Guarantee Letter.fixed.docx
+++ b/templates/Burial Case Study and GL/Burial Case Study-Guarantee Letter.fixed.docx
@@ -1,6 +1,6 @@
 
 <file path=word/document.xml><?xml version="1.0" encoding="utf-8"?>
-<w:document xmlns:wpc="http://schemas.microsoft.com/office/word/2010/wordprocessingCanvas" xmlns:cx="http://schemas.microsoft.com/office/drawing/2014/chartex" xmlns:cx1="http://schemas.microsoft.com/office/drawing/2015/9/8/chartex" xmlns:cx2="http://schemas.microsoft.com/office/drawing/2015/10/21/chartex" xmlns:cx3="http://schemas.microsoft.com/office/drawing/2016/5/9/chartex" xmlns:cx4="http://schemas.microsoft.com/office/drawing/2016/5/10/chartex" xmlns:cx5="http://schemas.microsoft.com/office/drawing/2016/5/11/chartex" xmlns:cx6="http://schemas.microsoft.com/office/drawing/2016/5/12/chartex" xmlns:cx7="http://schemas.microsoft.com/office/drawing/2016/5/13/chartex" xmlns:cx8="http://schemas.microsoft.com/office/drawing/2016/5/14/chartex" xmlns:mc="http://schemas.openxmlformats.org/markup-compatibility/2006" xmlns:aink="http://schemas.microsoft.com/office/drawing/2016/ink" xmlns:am3d="http://schemas.microsoft.com/office/drawing/2017/model3d" xmlns:o="urn:schemas-microsoft-com:office:office" xmlns:oel="http://schemas.microsoft.com/office/2019/extlst" xmlns:r="http://schemas.openxmlformats.org/officeDocument/2006/relationships" xmlns:m="http://schemas.openxmlformats.org/officeDocument/2006/math" xmlns:v="urn:schemas-microsoft-com:vml" xmlns:wp14="http://schemas.microsoft.com/office/word/2010/wordprocessingDrawing" xmlns:wp="http://schemas.openxmlformats.org/drawingml/2006/wordprocessingDrawing" xmlns:w10="urn:schemas-microsoft-com:office:word" xmlns:w="http://schemas.openxmlformats.org/wordprocessingml/2006/main" xmlns:w14="http://schemas.microsoft.com/office/word/2010/wordml" xmlns:w15="http://schemas.microsoft.com/office/word/2012/wordml" xmlns:w16cex="http://schemas.microsoft.com/office/word/2018/wordml/cex" xmlns:w16cid="http://schemas.microsoft.com/office/word/2016/wordml/cid" xmlns:w16="http://schemas.microsoft.com/office/word/2018/wordml" xmlns:w16du="http://schemas.microsoft.com/office/word/2023/wordml/word16du" xmlns:w16sdtdh="http://schemas.microsoft.com/office/word/2020/wordml/sdtdatahash" xmlns:w16sdtfl="http://schemas.microsoft.com/office/word/2024/wordml/sdtformatlock" xmlns:w16se="http://schemas.microsoft.com/office/word/2015/wordml/symex" xmlns:wpg="http://schemas.microsoft.com/office/word/2010/wordprocessingGroup" xmlns:wpi="http://schemas.microsoft.com/office/word/2010/wordprocessingInk" xmlns:wne="http://schemas.microsoft.com/office/word/2006/wordml" xmlns:wps="http://schemas.microsoft.com/office/word/2010/wordprocessingShape" mc:Ignorable="w14 w15 w16se w16cid w16 w16cex w16sdtdh w16sdtfl w16du wp14">
+<w:document xmlns:wpc="http://schemas.microsoft.com/office/word/2010/wordprocessingCanvas" xmlns:cx="http://schemas.microsoft.com/office/drawing/2014/chartex" xmlns:cx1="http://schemas.microsoft.com/office/drawing/2015/9/8/chartex" xmlns:cx2="http://schemas.microsoft.com/office/drawing/2015/10/21/chartex" xmlns:cx3="http://schemas.microsoft.com/office/drawing/2016/5/9/chartex" xmlns:cx4="http://schemas.microsoft.com/office/drawing/2016/5/10/chartex" xmlns:cx5="http://schemas.microsoft.com/office/drawing/2016/5/11/chartex" xmlns:cx6="http://schemas.microsoft.com/office/drawing/2016/5/12/chartex" xmlns:cx7="http://schemas.microsoft.com/office/drawing/2016/5/13/chartex" xmlns:cx8="http://schemas.microsoft.com/office/drawing/2016/5/14/chartex" xmlns:mc="http://schemas.openxmlformats.org/markup-compatibility/2006" xmlns:aink="http://schemas.microsoft.com/office/drawing/2016/ink" xmlns:am3d="http://schemas.microsoft.com/office/drawing/2017/model3d" xmlns:o="urn:schemas-microsoft-com:office:office" xmlns:oel="http://schemas.microsoft.com/office/2019/extlst" xmlns:r="http://schemas.openxmlformats.org/officeDocument/2006/relationships" xmlns:m="http://schemas.openxmlformats.org/officeDocument/2006/math" xmlns:v="urn:schemas-microsoft-com:vml" xmlns:wp14="http://schemas.microsoft.com/office/word/2010/wordprocessingDrawing" xmlns:wp="http://schemas.openxmlformats.org/drawingml/2006/wordprocessingDrawing" xmlns:w10="urn:schemas-microsoft-com:office:word" xmlns:w="http://schemas.openxmlformats.org/wordprocessingml/2006/main" xmlns:w14="http://schemas.microsoft.com/office/word/2010/wordml" xmlns:w15="http://schemas.microsoft.com/office/word/2012/wordml" xmlns:w16cei="http://schemas.microsoft.com/office/word/2026/wordml/cei" xmlns:w16cex="http://schemas.microsoft.com/office/word/2018/wordml/cex" xmlns:w16cid="http://schemas.microsoft.com/office/word/2016/wordml/cid" xmlns:w16="http://schemas.microsoft.com/office/word/2018/wordml" xmlns:w16du="http://schemas.microsoft.com/office/word/2023/wordml/word16du" xmlns:w16sdtdh="http://schemas.microsoft.com/office/word/2020/wordml/sdtdatahash" xmlns:w16sdtfl="http://schemas.microsoft.com/office/word/2024/wordml/sdtformatlock" xmlns:w16se="http://schemas.microsoft.com/office/word/2015/wordml/symex" xmlns:wpg="http://schemas.microsoft.com/office/word/2010/wordprocessingGroup" xmlns:wpi="http://schemas.microsoft.com/office/word/2010/wordprocessingInk" xmlns:wne="http://schemas.microsoft.com/office/word/2006/wordml" xmlns:wps="http://schemas.microsoft.com/office/word/2010/wordprocessingShape" mc:Ignorable="w14 w15 w16se w16cid w16 w16cex w16sdtdh w16sdtfl w16du wp14">
   <w:body>
     <w:p>
       <w:pPr>
@@ -423,6 +423,16 @@
           <w:szCs w:val="24"/>
         </w:rPr>
         <w:t>{intermitentPlace}</w:t>
+      </w:r>
+      <w:r>
+        <w:rPr>
+          <w:rFonts w:ascii="Arial" w:hAnsi="Arial" w:cs="Arial"/>
+          <w:b/>
+          <w:bCs/>
+          <w:sz w:val="24"/>
+          <w:szCs w:val="24"/>
+        </w:rPr>
+        <w:t>.</w:t>
       </w:r>
     </w:p>
     <w:p>
@@ -1054,18 +1064,17 @@
           <w:b/>
           <w:sz w:val="24"/>
           <w:szCs w:val="24"/>
-          <w:u w:val="single"/>
         </w:rPr>
         <w:t>{</w:t>
       </w:r>
       <w:proofErr w:type="spellStart"/>
-      <w:r>
-        <w:rPr>
-          <w:rFonts w:ascii="Arial" w:hAnsi="Arial" w:cs="Arial"/>
-          <w:b/>
-          <w:sz w:val="24"/>
-          <w:szCs w:val="24"/>
-          <w:u w:val="single"/>
+      <w:proofErr w:type="gramStart"/>
+      <w:r>
+        <w:rPr>
+          <w:rFonts w:ascii="Arial" w:hAnsi="Arial" w:cs="Arial"/>
+          <w:b/>
+          <w:sz w:val="24"/>
+          <w:szCs w:val="24"/>
         </w:rPr>
         <w:t>ConformeName</w:t>
       </w:r>
@@ -1076,7 +1085,6 @@
           <w:b/>
           <w:sz w:val="24"/>
           <w:szCs w:val="24"/>
-          <w:u w:val="single"/>
         </w:rPr>
         <w:t>}</w:t>
       </w:r>
@@ -1086,51 +1094,103 @@
           <w:b/>
           <w:sz w:val="24"/>
           <w:szCs w:val="24"/>
-          <w:u w:val="single"/>
-        </w:rPr>
-        <w:t xml:space="preserve">                                                                      </w:t>
-      </w:r>
-    </w:p>
-    <w:p>
-      <w:pPr>
-        <w:spacing w:after="0"/>
-        <w:rPr>
-          <w:rFonts w:ascii="Arial" w:hAnsi="Arial" w:cs="Arial"/>
-          <w:sz w:val="24"/>
-          <w:szCs w:val="24"/>
-        </w:rPr>
-      </w:pPr>
-      <w:r>
-        <w:rPr>
-          <w:rFonts w:ascii="Arial" w:hAnsi="Arial" w:cs="Arial"/>
-          <w:sz w:val="24"/>
-          <w:szCs w:val="24"/>
-        </w:rPr>
-        <w:t xml:space="preserve">{relationship}                                        </w:t>
-      </w:r>
-      <w:r>
-        <w:rPr>
-          <w:rFonts w:ascii="Arial" w:hAnsi="Arial" w:cs="Arial"/>
-          <w:sz w:val="24"/>
-          <w:szCs w:val="24"/>
-        </w:rPr>
-        <w:t xml:space="preserve">                                    </w:t>
-      </w:r>
-    </w:p>
-    <w:p>
-      <w:pPr>
-        <w:spacing w:after="0"/>
-        <w:rPr>
-          <w:rFonts w:ascii="Arial" w:hAnsi="Arial" w:cs="Arial"/>
-          <w:sz w:val="24"/>
-          <w:szCs w:val="24"/>
-        </w:rPr>
-      </w:pPr>
-      <w:r>
-        <w:rPr>
-          <w:rFonts w:ascii="Arial" w:hAnsi="Arial" w:cs="Arial"/>
-        </w:rPr>
-        <w:t xml:space="preserve">                                                                                                   _____________________</w:t>
+        </w:rPr>
+        <w:t xml:space="preserve">   </w:t>
+      </w:r>
+      <w:proofErr w:type="gramEnd"/>
+      <w:r>
+        <w:rPr>
+          <w:rFonts w:ascii="Arial" w:hAnsi="Arial" w:cs="Arial"/>
+          <w:b/>
+          <w:sz w:val="24"/>
+          <w:szCs w:val="24"/>
+        </w:rPr>
+        <w:t xml:space="preserve">                                                           </w:t>
+      </w:r>
+      <w:r>
+        <w:rPr>
+          <w:rFonts w:ascii="Arial" w:hAnsi="Arial" w:cs="Arial"/>
+        </w:rPr>
+        <w:t>_____________________</w:t>
+      </w:r>
+      <w:r>
+        <w:rPr>
+          <w:rFonts w:ascii="Arial" w:hAnsi="Arial" w:cs="Arial"/>
+          <w:b/>
+          <w:sz w:val="24"/>
+          <w:szCs w:val="24"/>
+        </w:rPr>
+        <w:t xml:space="preserve">                  </w:t>
+      </w:r>
+      <w:r>
+        <w:rPr>
+          <w:rFonts w:ascii="Arial" w:hAnsi="Arial" w:cs="Arial"/>
+          <w:b/>
+          <w:sz w:val="24"/>
+          <w:szCs w:val="24"/>
+        </w:rPr>
+        <w:t xml:space="preserve">                                          </w:t>
+      </w:r>
+      <w:r>
+        <w:rPr>
+          <w:rFonts w:ascii="Arial" w:hAnsi="Arial" w:cs="Arial"/>
+          <w:b/>
+          <w:sz w:val="24"/>
+          <w:szCs w:val="24"/>
+        </w:rPr>
+        <w:t xml:space="preserve">                                                 </w:t>
+      </w:r>
+    </w:p>
+    <w:p>
+      <w:pPr>
+        <w:spacing w:after="0"/>
+        <w:rPr>
+          <w:rFonts w:ascii="Arial" w:hAnsi="Arial" w:cs="Arial"/>
+          <w:sz w:val="24"/>
+          <w:szCs w:val="24"/>
+        </w:rPr>
+      </w:pPr>
+      <w:r>
+        <w:rPr>
+          <w:rFonts w:ascii="Arial" w:hAnsi="Arial" w:cs="Arial"/>
+          <w:sz w:val="24"/>
+          <w:szCs w:val="24"/>
+        </w:rPr>
+        <w:t>{</w:t>
+      </w:r>
+      <w:proofErr w:type="gramStart"/>
+      <w:r>
+        <w:rPr>
+          <w:rFonts w:ascii="Arial" w:hAnsi="Arial" w:cs="Arial"/>
+          <w:sz w:val="24"/>
+          <w:szCs w:val="24"/>
+        </w:rPr>
+        <w:t>relationship}</w:t>
+      </w:r>
+      <w:r>
+        <w:rPr>
+          <w:rFonts w:ascii="Arial" w:hAnsi="Arial" w:cs="Arial"/>
+          <w:sz w:val="24"/>
+          <w:szCs w:val="24"/>
+        </w:rPr>
+        <w:t xml:space="preserve">   </w:t>
+      </w:r>
+      <w:proofErr w:type="gramEnd"/>
+      <w:r>
+        <w:rPr>
+          <w:rFonts w:ascii="Arial" w:hAnsi="Arial" w:cs="Arial"/>
+          <w:sz w:val="24"/>
+          <w:szCs w:val="24"/>
+        </w:rPr>
+        <w:t xml:space="preserve">                                                                 </w:t>
+      </w:r>
+      <w:r>
+        <w:rPr>
+          <w:rFonts w:ascii="Arial" w:hAnsi="Arial" w:cs="Arial"/>
+          <w:sz w:val="24"/>
+          <w:szCs w:val="24"/>
+        </w:rPr>
+        <w:t>Signature over Printed Name</w:t>
       </w:r>
     </w:p>
     <w:p>
@@ -1149,31 +1209,7 @@
           <w:sz w:val="24"/>
           <w:szCs w:val="24"/>
         </w:rPr>
-        <w:t xml:space="preserve"> </w:t>
-      </w:r>
-      <w:r>
-        <w:rPr>
-          <w:rFonts w:ascii="Arial" w:hAnsi="Arial" w:cs="Arial"/>
-          <w:sz w:val="24"/>
-          <w:szCs w:val="24"/>
-        </w:rPr>
-        <w:t>Signature over Printed</w:t>
-      </w:r>
-      <w:r>
-        <w:rPr>
-          <w:rFonts w:ascii="Arial" w:hAnsi="Arial" w:cs="Arial"/>
-          <w:sz w:val="24"/>
-          <w:szCs w:val="24"/>
-        </w:rPr>
-        <w:t xml:space="preserve"> </w:t>
-      </w:r>
-      <w:r>
-        <w:rPr>
-          <w:rFonts w:ascii="Arial" w:hAnsi="Arial" w:cs="Arial"/>
-          <w:sz w:val="24"/>
-          <w:szCs w:val="24"/>
-        </w:rPr>
-        <w:t>Name</w:t>
+        <w:t xml:space="preserve">(Representative of the Funeral)                                                                                                                                                                                                                                                                                                                                                                                                                                                                                                                                                                                                                                                                                                                                                                                                                                                                                                                                                                                                                                                                                                                                                                                                                                                                                                                                                                                                                                                                                                                                                                                                                                                                                                                                                                                                                                                                                                                                                                                                                                                                                                                                                                                                                                                                                                                                                                                                                                                                                                                                                                                                                                                                                                                                                                                                                                                                                                                                                                                                                                                                                                                                                                                                                                                                                                                                                                                                                                                                                                                                                                                                                                                                                                                                                                                                                                                                                                                                                                                                                                                                                                                                                                                                                                                                                                                                                                                                                                                                                                                                                                                                                                                                                                                                                                                                                                                                                                                                                                                                                                                                                                                                                                                                                                                                                                                                                                                                                                                                                                                                                                                                                                                                                                                                                                                                                                                                                                                                                                                                                                                                                                                                                                                                                                                                                                                                                                                                                                                                                                                                                                                                                                                                                                                                                                                                                                                                                                                                                                                                                                                                                                                                                                                                                                                                                                                                                                                                                                                                                                                                                                                                                                                                                                                                                                                                                                                                                                                                                                                                                                                                                                                                                                                                                                                                                                                                                                                                                                                                                                                                                                                                                                                                                                                                                                                                                                                                                                                                                                                                                                                                                                                                                                                                                                                                                                                                                                                                                                                                                                                                                                                                                                                                                                                                                                                                                                                                                                                                                                                                                                                                                                                                                                                                                                                                                                                                                                                                                                                                                                                                                                                                                                                                                                                                                                                                                                                                                                                                                                                                                                                                                                                                                                                                                                                                                                                                                                                                                                                                                                                                                                                                                                                                                                                                                                                                                                                                                                                                                                                                                                                                                                                                                                                                                                                                                                                                                                                                                                                                                                                                                                                                                                                                                                                                                                                                                                                                                                                                                                                                                                                                                                                               </w:t>
       </w:r>
     </w:p>
     <w:p>
@@ -1186,14 +1222,17 @@
           <w:szCs w:val="24"/>
         </w:rPr>
       </w:pPr>
-      <w:r>
-        <w:rPr>
-          <w:rFonts w:ascii="Arial" w:hAnsi="Arial" w:cs="Arial"/>
-          <w:sz w:val="24"/>
-          <w:szCs w:val="24"/>
-        </w:rPr>
-        <w:t xml:space="preserve">(Representative of the Funeral)                                                                                                                                                                                                                                                                                                                                                                                                                                                                                                                                                                                                                                                                                                                                                                                                                                                                                                                                                                                                                                                                                                                                                                                                                                                                                                                                                                                                                                                                                                                                                                                                                                                                                                                                                                                                                                                                                                                                                                                                                                                                                                                                                                                                                                                                                                                                                                                                                                                                                                                                                                                                                                                                                                                                                                                                                                                                                                                                                                                                                                                                                                                                                                                                                                                                                                                                                                                                                                                                                                                                                                                                                                                                                                                                                                                                                                                                                                                                                                                                                                                                                                                                                                                                                                                                                                                                                                                                                                                                                                                                                                                                                                                                                                                                                                                                                                                                                                                                                                                                                                                                                                                                                                                                                                                                                                                                                                                                                                                                                                                                                                                                                                                                                                                                                                                                                                                                                                                                                                                                                                                                                                                                                                                                                                                                                                                                                                                                                                                                                                                                                                                                                                                                                                                                                                                                                                                                                                                                                                                                                                                                                                                                                                                                                                                                                                                                                                                                                                                                                                                                                                                                                                                                                                                                                                                                                                                                                                                                                                                                                                                                                                                                                                                                                                                                                                                                                                                                                                                                                                                                                                                                                                                                                                                                                                                                                                                                                                                                                                                                                                                                                                                                                                                                                                                                                                                                                                                                                                                                                                                                                                                                                                                                                                                                                                                                                                                                                                                                                                                                                                                                                                                                                                                                                                                                                                                                                                                                                                                                                                                                                                                                                                                                                                                                                                                                                                                                                                                                                                                                                                                                                                                                                                                                                                                                                                                                                                                                                                                                                                                                                                                                                                                                                                                                                                                                                                                                                                                                                                                                                                                                                                                                                                                                                                                                                                                                                                                                                                                                                                                                                                                                                                                                                                                                                                                                                                                                                                                                                                                                                                                                                                                               </w:t>
-      </w:r>
+    </w:p>
+    <w:p>
+      <w:pPr>
+        <w:spacing w:after="0"/>
+        <w:ind w:left="5760"/>
+        <w:rPr>
+          <w:rFonts w:ascii="Arial" w:hAnsi="Arial" w:cs="Arial"/>
+          <w:sz w:val="24"/>
+          <w:szCs w:val="24"/>
+        </w:rPr>
+      </w:pPr>
       <w:r>
         <w:rPr>
           <w:rFonts w:ascii="Arial" w:hAnsi="Arial" w:cs="Arial"/>
@@ -1334,8 +1373,40 @@
           <w:sz w:val="10"/>
           <w:szCs w:val="10"/>
         </w:rPr>
-        <w:t xml:space="preserve">   </w:t>
-      </w:r>
+        <w:t>Verification Code:</w:t>
+      </w:r>
+      <w:r>
+        <w:rPr>
+          <w:sz w:val="10"/>
+          <w:szCs w:val="10"/>
+        </w:rPr>
+        <w:t xml:space="preserve"> {</w:t>
+      </w:r>
+      <w:proofErr w:type="spellStart"/>
+      <w:r>
+        <w:rPr>
+          <w:sz w:val="10"/>
+          <w:szCs w:val="10"/>
+        </w:rPr>
+        <w:t>documentVerificationCode</w:t>
+      </w:r>
+      <w:proofErr w:type="spellEnd"/>
+      <w:r>
+        <w:rPr>
+          <w:sz w:val="10"/>
+          <w:szCs w:val="10"/>
+        </w:rPr>
+        <w:t>}</w:t>
+      </w:r>
+    </w:p>
+    <w:p>
+      <w:pPr>
+        <w:spacing w:after="0"/>
+        <w:rPr>
+          <w:sz w:val="10"/>
+          <w:szCs w:val="10"/>
+        </w:rPr>
+      </w:pPr>
       <w:r>
         <w:rPr>
           <w:b/>
@@ -1343,64 +1414,23 @@
           <w:sz w:val="10"/>
           <w:szCs w:val="10"/>
         </w:rPr>
-        <w:t>Verification Code:</w:t>
-      </w:r>
-      <w:r>
+        <w:t xml:space="preserve">   </w:t>
+      </w:r>
+    </w:p>
+    <w:p>
+      <w:pPr>
+        <w:spacing w:after="0"/>
         <w:rPr>
           <w:sz w:val="10"/>
           <w:szCs w:val="10"/>
         </w:rPr>
-        <w:t xml:space="preserve"> {</w:t>
-      </w:r>
-      <w:proofErr w:type="spellStart"/>
+      </w:pPr>
       <w:r>
         <w:rPr>
           <w:sz w:val="10"/>
           <w:szCs w:val="10"/>
         </w:rPr>
-        <w:t>documentVerificationCode</w:t>
-      </w:r>
-      <w:proofErr w:type="spellEnd"/>
-      <w:r>
-        <w:rPr>
-          <w:sz w:val="10"/>
-          <w:szCs w:val="10"/>
-        </w:rPr>
-        <w:t>}</w:t>
-      </w:r>
-    </w:p>
-    <w:p>
-      <w:pPr>
-        <w:spacing w:after="0"/>
-        <w:rPr>
-          <w:sz w:val="10"/>
-          <w:szCs w:val="10"/>
-        </w:rPr>
-      </w:pPr>
-      <w:r>
-        <w:rPr>
-          <w:b/>
-          <w:bCs/>
-          <w:sz w:val="10"/>
-          <w:szCs w:val="10"/>
-        </w:rPr>
-        <w:t xml:space="preserve">   </w:t>
-      </w:r>
-    </w:p>
-    <w:p>
-      <w:pPr>
-        <w:spacing w:after="0"/>
-        <w:rPr>
-          <w:sz w:val="10"/>
-          <w:szCs w:val="10"/>
-        </w:rPr>
-      </w:pPr>
-      <w:r>
-        <w:rPr>
-          <w:sz w:val="10"/>
-          <w:szCs w:val="10"/>
-        </w:rPr>
-        <w:t xml:space="preserve">   S</w:t>
+        <w:t>S</w:t>
       </w:r>
       <w:r>
         <w:rPr>
@@ -1431,7 +1461,7 @@
 </file>
 
 <file path=word/endnotes.xml><?xml version="1.0" encoding="utf-8"?>
-<w:endnotes xmlns:wpc="http://schemas.microsoft.com/office/word/2010/wordprocessingCanvas" xmlns:cx="http://schemas.microsoft.com/office/drawing/2014/chartex" xmlns:cx1="http://schemas.microsoft.com/office/drawing/2015/9/8/chartex" xmlns:cx2="http://schemas.microsoft.com/office/drawing/2015/10/21/chartex" xmlns:cx3="http://schemas.microsoft.com/office/drawing/2016/5/9/chartex" xmlns:cx4="http://schemas.microsoft.com/office/drawing/2016/5/10/chartex" xmlns:cx5="http://schemas.microsoft.com/office/drawing/2016/5/11/chartex" xmlns:cx6="http://schemas.microsoft.com/office/drawing/2016/5/12/chartex" xmlns:cx7="http://schemas.microsoft.com/office/drawing/2016/5/13/chartex" xmlns:cx8="http://schemas.microsoft.com/office/drawing/2016/5/14/chartex" xmlns:mc="http://schemas.openxmlformats.org/markup-compatibility/2006" xmlns:aink="http://schemas.microsoft.com/office/drawing/2016/ink" xmlns:am3d="http://schemas.microsoft.com/office/drawing/2017/model3d" xmlns:o="urn:schemas-microsoft-com:office:office" xmlns:oel="http://schemas.microsoft.com/office/2019/extlst" xmlns:r="http://schemas.openxmlformats.org/officeDocument/2006/relationships" xmlns:m="http://schemas.openxmlformats.org/officeDocument/2006/math" xmlns:v="urn:schemas-microsoft-com:vml" xmlns:wp14="http://schemas.microsoft.com/office/word/2010/wordprocessingDrawing" xmlns:wp="http://schemas.openxmlformats.org/drawingml/2006/wordprocessingDrawing" xmlns:w10="urn:schemas-microsoft-com:office:word" xmlns:w="http://schemas.openxmlformats.org/wordprocessingml/2006/main" xmlns:w14="http://schemas.microsoft.com/office/word/2010/wordml" xmlns:w15="http://schemas.microsoft.com/office/word/2012/wordml" xmlns:w16cex="http://schemas.microsoft.com/office/word/2018/wordml/cex" xmlns:w16cid="http://schemas.microsoft.com/office/word/2016/wordml/cid" xmlns:w16="http://schemas.microsoft.com/office/word/2018/wordml" xmlns:w16du="http://schemas.microsoft.com/office/word/2023/wordml/word16du" xmlns:w16sdtdh="http://schemas.microsoft.com/office/word/2020/wordml/sdtdatahash" xmlns:w16sdtfl="http://schemas.microsoft.com/office/word/2024/wordml/sdtformatlock" xmlns:w16se="http://schemas.microsoft.com/office/word/2015/wordml/symex" xmlns:wpg="http://schemas.microsoft.com/office/word/2010/wordprocessingGroup" xmlns:wpi="http://schemas.microsoft.com/office/word/2010/wordprocessingInk" xmlns:wne="http://schemas.microsoft.com/office/word/2006/wordml" xmlns:wps="http://schemas.microsoft.com/office/word/2010/wordprocessingShape" mc:Ignorable="w14 w15 w16se w16cid w16 w16cex w16sdtdh w16sdtfl w16du wp14">
+<w:endnotes xmlns:wpc="http://schemas.microsoft.com/office/word/2010/wordprocessingCanvas" xmlns:cx="http://schemas.microsoft.com/office/drawing/2014/chartex" xmlns:cx1="http://schemas.microsoft.com/office/drawing/2015/9/8/chartex" xmlns:cx2="http://schemas.microsoft.com/office/drawing/2015/10/21/chartex" xmlns:cx3="http://schemas.microsoft.com/office/drawing/2016/5/9/chartex" xmlns:cx4="http://schemas.microsoft.com/office/drawing/2016/5/10/chartex" xmlns:cx5="http://schemas.microsoft.com/office/drawing/2016/5/11/chartex" xmlns:cx6="http://schemas.microsoft.com/office/drawing/2016/5/12/chartex" xmlns:cx7="http://schemas.microsoft.com/office/drawing/2016/5/13/chartex" xmlns:cx8="http://schemas.microsoft.com/office/drawing/2016/5/14/chartex" xmlns:mc="http://schemas.openxmlformats.org/markup-compatibility/2006" xmlns:aink="http://schemas.microsoft.com/office/drawing/2016/ink" xmlns:am3d="http://schemas.microsoft.com/office/drawing/2017/model3d" xmlns:o="urn:schemas-microsoft-com:office:office" xmlns:oel="http://schemas.microsoft.com/office/2019/extlst" xmlns:r="http://schemas.openxmlformats.org/officeDocument/2006/relationships" xmlns:m="http://schemas.openxmlformats.org/officeDocument/2006/math" xmlns:v="urn:schemas-microsoft-com:vml" xmlns:wp14="http://schemas.microsoft.com/office/word/2010/wordprocessingDrawing" xmlns:wp="http://schemas.openxmlformats.org/drawingml/2006/wordprocessingDrawing" xmlns:w10="urn:schemas-microsoft-com:office:word" xmlns:w="http://schemas.openxmlformats.org/wordprocessingml/2006/main" xmlns:w14="http://schemas.microsoft.com/office/word/2010/wordml" xmlns:w15="http://schemas.microsoft.com/office/word/2012/wordml" xmlns:w16cei="http://schemas.microsoft.com/office/word/2026/wordml/cei" xmlns:w16cex="http://schemas.microsoft.com/office/word/2018/wordml/cex" xmlns:w16cid="http://schemas.microsoft.com/office/word/2016/wordml/cid" xmlns:w16="http://schemas.microsoft.com/office/word/2018/wordml" xmlns:w16du="http://schemas.microsoft.com/office/word/2023/wordml/word16du" xmlns:w16sdtdh="http://schemas.microsoft.com/office/word/2020/wordml/sdtdatahash" xmlns:w16sdtfl="http://schemas.microsoft.com/office/word/2024/wordml/sdtformatlock" xmlns:w16se="http://schemas.microsoft.com/office/word/2015/wordml/symex" xmlns:wpg="http://schemas.microsoft.com/office/word/2010/wordprocessingGroup" xmlns:wpi="http://schemas.microsoft.com/office/word/2010/wordprocessingInk" xmlns:wne="http://schemas.microsoft.com/office/word/2006/wordml" xmlns:wps="http://schemas.microsoft.com/office/word/2010/wordprocessingShape" mc:Ignorable="w14 w15 w16se w16cid w16 w16cex w16sdtdh w16sdtfl w16du wp14">
   <w:endnote w:type="separator" w:id="-1">
     <w:p>
       <w:pPr>
@@ -1456,7 +1486,7 @@
 </file>
 
 <file path=word/footer1.xml><?xml version="1.0" encoding="utf-8"?>
-<w:ftr xmlns:wpc="http://schemas.microsoft.com/office/word/2010/wordprocessingCanvas" xmlns:cx="http://schemas.microsoft.com/office/drawing/2014/chartex" xmlns:cx1="http://schemas.microsoft.com/office/drawing/2015/9/8/chartex" xmlns:cx2="http://schemas.microsoft.com/office/drawing/2015/10/21/chartex" xmlns:cx3="http://schemas.microsoft.com/office/drawing/2016/5/9/chartex" xmlns:cx4="http://schemas.microsoft.com/office/drawing/2016/5/10/chartex" xmlns:cx5="http://schemas.microsoft.com/office/drawing/2016/5/11/chartex" xmlns:cx6="http://schemas.microsoft.com/office/drawing/2016/5/12/chartex" xmlns:cx7="http://schemas.microsoft.com/office/drawing/2016/5/13/chartex" xmlns:cx8="http://schemas.microsoft.com/office/drawing/2016/5/14/chartex" xmlns:mc="http://schemas.openxmlformats.org/markup-compatibility/2006" xmlns:aink="http://schemas.microsoft.com/office/drawing/2016/ink" xmlns:am3d="http://schemas.microsoft.com/office/drawing/2017/model3d" xmlns:o="urn:schemas-microsoft-com:office:office" xmlns:oel="http://schemas.microsoft.com/office/2019/extlst" xmlns:r="http://schemas.openxmlformats.org/officeDocument/2006/relationships" xmlns:m="http://schemas.openxmlformats.org/officeDocument/2006/math" xmlns:v="urn:schemas-microsoft-com:vml" xmlns:wp14="http://schemas.microsoft.com/office/word/2010/wordprocessingDrawing" xmlns:wp="http://schemas.openxmlformats.org/drawingml/2006/wordprocessingDrawing" xmlns:w10="urn:schemas-microsoft-com:office:word" xmlns:w="http://schemas.openxmlformats.org/wordprocessingml/2006/main" xmlns:w14="http://schemas.microsoft.com/office/word/2010/wordml" xmlns:w15="http://schemas.microsoft.com/office/word/2012/wordml" xmlns:w16cex="http://schemas.microsoft.com/office/word/2018/wordml/cex" xmlns:w16cid="http://schemas.microsoft.com/office/word/2016/wordml/cid" xmlns:w16="http://schemas.microsoft.com/office/word/2018/wordml" xmlns:w16du="http://schemas.microsoft.com/office/word/2023/wordml/word16du" xmlns:w16sdtdh="http://schemas.microsoft.com/office/word/2020/wordml/sdtdatahash" xmlns:w16sdtfl="http://schemas.microsoft.com/office/word/2024/wordml/sdtformatlock" xmlns:w16se="http://schemas.microsoft.com/office/word/2015/wordml/symex" xmlns:wpg="http://schemas.microsoft.com/office/word/2010/wordprocessingGroup" xmlns:wpi="http://schemas.microsoft.com/office/word/2010/wordprocessingInk" xmlns:wne="http://schemas.microsoft.com/office/word/2006/wordml" xmlns:wps="http://schemas.microsoft.com/office/word/2010/wordprocessingShape" mc:Ignorable="w14 w15 w16se w16cid w16 w16cex w16sdtdh w16sdtfl w16du wp14">
+<w:ftr xmlns:wpc="http://schemas.microsoft.com/office/word/2010/wordprocessingCanvas" xmlns:cx="http://schemas.microsoft.com/office/drawing/2014/chartex" xmlns:cx1="http://schemas.microsoft.com/office/drawing/2015/9/8/chartex" xmlns:cx2="http://schemas.microsoft.com/office/drawing/2015/10/21/chartex" xmlns:cx3="http://schemas.microsoft.com/office/drawing/2016/5/9/chartex" xmlns:cx4="http://schemas.microsoft.com/office/drawing/2016/5/10/chartex" xmlns:cx5="http://schemas.microsoft.com/office/drawing/2016/5/11/chartex" xmlns:cx6="http://schemas.microsoft.com/office/drawing/2016/5/12/chartex" xmlns:cx7="http://schemas.microsoft.com/office/drawing/2016/5/13/chartex" xmlns:cx8="http://schemas.microsoft.com/office/drawing/2016/5/14/chartex" xmlns:mc="http://schemas.openxmlformats.org/markup-compatibility/2006" xmlns:aink="http://schemas.microsoft.com/office/drawing/2016/ink" xmlns:am3d="http://schemas.microsoft.com/office/drawing/2017/model3d" xmlns:o="urn:schemas-microsoft-com:office:office" xmlns:oel="http://schemas.microsoft.com/office/2019/extlst" xmlns:r="http://schemas.openxmlformats.org/officeDocument/2006/relationships" xmlns:m="http://schemas.openxmlformats.org/officeDocument/2006/math" xmlns:v="urn:schemas-microsoft-com:vml" xmlns:wp14="http://schemas.microsoft.com/office/word/2010/wordprocessingDrawing" xmlns:wp="http://schemas.openxmlformats.org/drawingml/2006/wordprocessingDrawing" xmlns:w10="urn:schemas-microsoft-com:office:word" xmlns:w="http://schemas.openxmlformats.org/wordprocessingml/2006/main" xmlns:w14="http://schemas.microsoft.com/office/word/2010/wordml" xmlns:w15="http://schemas.microsoft.com/office/word/2012/wordml" xmlns:w16cei="http://schemas.microsoft.com/office/word/2026/wordml/cei" xmlns:w16cex="http://schemas.microsoft.com/office/word/2018/wordml/cex" xmlns:w16cid="http://schemas.microsoft.com/office/word/2016/wordml/cid" xmlns:w16="http://schemas.microsoft.com/office/word/2018/wordml" xmlns:w16du="http://schemas.microsoft.com/office/word/2023/wordml/word16du" xmlns:w16sdtdh="http://schemas.microsoft.com/office/word/2020/wordml/sdtdatahash" xmlns:w16sdtfl="http://schemas.microsoft.com/office/word/2024/wordml/sdtformatlock" xmlns:w16se="http://schemas.microsoft.com/office/word/2015/wordml/symex" xmlns:wpg="http://schemas.microsoft.com/office/word/2010/wordprocessingGroup" xmlns:wpi="http://schemas.microsoft.com/office/word/2010/wordprocessingInk" xmlns:wne="http://schemas.microsoft.com/office/word/2006/wordml" xmlns:wps="http://schemas.microsoft.com/office/word/2010/wordprocessingShape" mc:Ignorable="w14 w15 w16se w16cid w16 w16cex w16sdtdh w16sdtfl w16du wp14">
   <w:p>
     <w:pPr>
       <w:tabs>
@@ -1657,7 +1687,7 @@
 </file>
 
 <file path=word/footnotes.xml><?xml version="1.0" encoding="utf-8"?>
-<w:footnotes xmlns:wpc="http://schemas.microsoft.com/office/word/2010/wordprocessingCanvas" xmlns:cx="http://schemas.microsoft.com/office/drawing/2014/chartex" xmlns:cx1="http://schemas.microsoft.com/office/drawing/2015/9/8/chartex" xmlns:cx2="http://schemas.microsoft.com/office/drawing/2015/10/21/chartex" xmlns:cx3="http://schemas.microsoft.com/office/drawing/2016/5/9/chartex" xmlns:cx4="http://schemas.microsoft.com/office/drawing/2016/5/10/chartex" xmlns:cx5="http://schemas.microsoft.com/office/drawing/2016/5/11/chartex" xmlns:cx6="http://schemas.microsoft.com/office/drawing/2016/5/12/chartex" xmlns:cx7="http://schemas.microsoft.com/office/drawing/2016/5/13/chartex" xmlns:cx8="http://schemas.microsoft.com/office/drawing/2016/5/14/chartex" xmlns:mc="http://schemas.openxmlformats.org/markup-compatibility/2006" xmlns:aink="http://schemas.microsoft.com/office/drawing/2016/ink" xmlns:am3d="http://schemas.microsoft.com/office/drawing/2017/model3d" xmlns:o="urn:schemas-microsoft-com:office:office" xmlns:oel="http://schemas.microsoft.com/office/2019/extlst" xmlns:r="http://schemas.openxmlformats.org/officeDocument/2006/relationships" xmlns:m="http://schemas.openxmlformats.org/officeDocument/2006/math" xmlns:v="urn:schemas-microsoft-com:vml" xmlns:wp14="http://schemas.microsoft.com/office/word/2010/wordprocessingDrawing" xmlns:wp="http://schemas.openxmlformats.org/drawingml/2006/wordprocessingDrawing" xmlns:w10="urn:schemas-microsoft-com:office:word" xmlns:w="http://schemas.openxmlformats.org/wordprocessingml/2006/main" xmlns:w14="http://schemas.microsoft.com/office/word/2010/wordml" xmlns:w15="http://schemas.microsoft.com/office/word/2012/wordml" xmlns:w16cex="http://schemas.microsoft.com/office/word/2018/wordml/cex" xmlns:w16cid="http://schemas.microsoft.com/office/word/2016/wordml/cid" xmlns:w16="http://schemas.microsoft.com/office/word/2018/wordml" xmlns:w16du="http://schemas.microsoft.com/office/word/2023/wordml/word16du" xmlns:w16sdtdh="http://schemas.microsoft.com/office/word/2020/wordml/sdtdatahash" xmlns:w16sdtfl="http://schemas.microsoft.com/office/word/2024/wordml/sdtformatlock" xmlns:w16se="http://schemas.microsoft.com/office/word/2015/wordml/symex" xmlns:wpg="http://schemas.microsoft.com/office/word/2010/wordprocessingGroup" xmlns:wpi="http://schemas.microsoft.com/office/word/2010/wordprocessingInk" xmlns:wne="http://schemas.microsoft.com/office/word/2006/wordml" xmlns:wps="http://schemas.microsoft.com/office/word/2010/wordprocessingShape" mc:Ignorable="w14 w15 w16se w16cid w16 w16cex w16sdtdh w16sdtfl w16du wp14">
+<w:footnotes xmlns:wpc="http://schemas.microsoft.com/office/word/2010/wordprocessingCanvas" xmlns:cx="http://schemas.microsoft.com/office/drawing/2014/chartex" xmlns:cx1="http://schemas.microsoft.com/office/drawing/2015/9/8/chartex" xmlns:cx2="http://schemas.microsoft.com/office/drawing/2015/10/21/chartex" xmlns:cx3="http://schemas.microsoft.com/office/drawing/2016/5/9/chartex" xmlns:cx4="http://schemas.microsoft.com/office/drawing/2016/5/10/chartex" xmlns:cx5="http://schemas.microsoft.com/office/drawing/2016/5/11/chartex" xmlns:cx6="http://schemas.microsoft.com/office/drawing/2016/5/12/chartex" xmlns:cx7="http://schemas.microsoft.com/office/drawing/2016/5/13/chartex" xmlns:cx8="http://schemas.microsoft.com/office/drawing/2016/5/14/chartex" xmlns:mc="http://schemas.openxmlformats.org/markup-compatibility/2006" xmlns:aink="http://schemas.microsoft.com/office/drawing/2016/ink" xmlns:am3d="http://schemas.microsoft.com/office/drawing/2017/model3d" xmlns:o="urn:schemas-microsoft-com:office:office" xmlns:oel="http://schemas.microsoft.com/office/2019/extlst" xmlns:r="http://schemas.openxmlformats.org/officeDocument/2006/relationships" xmlns:m="http://schemas.openxmlformats.org/officeDocument/2006/math" xmlns:v="urn:schemas-microsoft-com:vml" xmlns:wp14="http://schemas.microsoft.com/office/word/2010/wordprocessingDrawing" xmlns:wp="http://schemas.openxmlformats.org/drawingml/2006/wordprocessingDrawing" xmlns:w10="urn:schemas-microsoft-com:office:word" xmlns:w="http://schemas.openxmlformats.org/wordprocessingml/2006/main" xmlns:w14="http://schemas.microsoft.com/office/word/2010/wordml" xmlns:w15="http://schemas.microsoft.com/office/word/2012/wordml" xmlns:w16cei="http://schemas.microsoft.com/office/word/2026/wordml/cei" xmlns:w16cex="http://schemas.microsoft.com/office/word/2018/wordml/cex" xmlns:w16cid="http://schemas.microsoft.com/office/word/2016/wordml/cid" xmlns:w16="http://schemas.microsoft.com/office/word/2018/wordml" xmlns:w16du="http://schemas.microsoft.com/office/word/2023/wordml/word16du" xmlns:w16sdtdh="http://schemas.microsoft.com/office/word/2020/wordml/sdtdatahash" xmlns:w16sdtfl="http://schemas.microsoft.com/office/word/2024/wordml/sdtformatlock" xmlns:w16se="http://schemas.microsoft.com/office/word/2015/wordml/symex" xmlns:wpg="http://schemas.microsoft.com/office/word/2010/wordprocessingGroup" xmlns:wpi="http://schemas.microsoft.com/office/word/2010/wordprocessingInk" xmlns:wne="http://schemas.microsoft.com/office/word/2006/wordml" xmlns:wps="http://schemas.microsoft.com/office/word/2010/wordprocessingShape" mc:Ignorable="w14 w15 w16se w16cid w16 w16cex w16sdtdh w16sdtfl w16du wp14">
   <w:footnote w:type="separator" w:id="-1">
     <w:p>
       <w:pPr>
@@ -1682,7 +1712,7 @@
 </file>
 
 <file path=word/header1.xml><?xml version="1.0" encoding="utf-8"?>
-<w:hdr xmlns:wpc="http://schemas.microsoft.com/office/word/2010/wordprocessingCanvas" xmlns:cx="http://schemas.microsoft.com/office/drawing/2014/chartex" xmlns:cx1="http://schemas.microsoft.com/office/drawing/2015/9/8/chartex" xmlns:cx2="http://schemas.microsoft.com/office/drawing/2015/10/21/chartex" xmlns:cx3="http://schemas.microsoft.com/office/drawing/2016/5/9/chartex" xmlns:cx4="http://schemas.microsoft.com/office/drawing/2016/5/10/chartex" xmlns:cx5="http://schemas.microsoft.com/office/drawing/2016/5/11/chartex" xmlns:cx6="http://schemas.microsoft.com/office/drawing/2016/5/12/chartex" xmlns:cx7="http://schemas.microsoft.com/office/drawing/2016/5/13/chartex" xmlns:cx8="http://schemas.microsoft.com/office/drawing/2016/5/14/chartex" xmlns:mc="http://schemas.openxmlformats.org/markup-compatibility/2006" xmlns:aink="http://schemas.microsoft.com/office/drawing/2016/ink" xmlns:am3d="http://schemas.microsoft.com/office/drawing/2017/model3d" xmlns:o="urn:schemas-microsoft-com:office:office" xmlns:oel="http://schemas.microsoft.com/office/2019/extlst" xmlns:r="http://schemas.openxmlformats.org/officeDocument/2006/relationships" xmlns:m="http://schemas.openxmlformats.org/officeDocument/2006/math" xmlns:v="urn:schemas-microsoft-com:vml" xmlns:wp14="http://schemas.microsoft.com/office/word/2010/wordprocessingDrawing" xmlns:wp="http://schemas.openxmlformats.org/drawingml/2006/wordprocessingDrawing" xmlns:w10="urn:schemas-microsoft-com:office:word" xmlns:w="http://schemas.openxmlformats.org/wordprocessingml/2006/main" xmlns:w14="http://schemas.microsoft.com/office/word/2010/wordml" xmlns:w15="http://schemas.microsoft.com/office/word/2012/wordml" xmlns:w16cex="http://schemas.microsoft.com/office/word/2018/wordml/cex" xmlns:w16cid="http://schemas.microsoft.com/office/word/2016/wordml/cid" xmlns:w16="http://schemas.microsoft.com/office/word/2018/wordml" xmlns:w16du="http://schemas.microsoft.com/office/word/2023/wordml/word16du" xmlns:w16sdtdh="http://schemas.microsoft.com/office/word/2020/wordml/sdtdatahash" xmlns:w16sdtfl="http://schemas.microsoft.com/office/word/2024/wordml/sdtformatlock" xmlns:w16se="http://schemas.microsoft.com/office/word/2015/wordml/symex" xmlns:wpg="http://schemas.microsoft.com/office/word/2010/wordprocessingGroup" xmlns:wpi="http://schemas.microsoft.com/office/word/2010/wordprocessingInk" xmlns:wne="http://schemas.microsoft.com/office/word/2006/wordml" xmlns:wps="http://schemas.microsoft.com/office/word/2010/wordprocessingShape" mc:Ignorable="w14 w15 w16se w16cid w16 w16cex w16sdtdh w16sdtfl w16du wp14">
+<w:hdr xmlns:wpc="http://schemas.microsoft.com/office/word/2010/wordprocessingCanvas" xmlns:cx="http://schemas.microsoft.com/office/drawing/2014/chartex" xmlns:cx1="http://schemas.microsoft.com/office/drawing/2015/9/8/chartex" xmlns:cx2="http://schemas.microsoft.com/office/drawing/2015/10/21/chartex" xmlns:cx3="http://schemas.microsoft.com/office/drawing/2016/5/9/chartex" xmlns:cx4="http://schemas.microsoft.com/office/drawing/2016/5/10/chartex" xmlns:cx5="http://schemas.microsoft.com/office/drawing/2016/5/11/chartex" xmlns:cx6="http://schemas.microsoft.com/office/drawing/2016/5/12/chartex" xmlns:cx7="http://schemas.microsoft.com/office/drawing/2016/5/13/chartex" xmlns:cx8="http://schemas.microsoft.com/office/drawing/2016/5/14/chartex" xmlns:mc="http://schemas.openxmlformats.org/markup-compatibility/2006" xmlns:aink="http://schemas.microsoft.com/office/drawing/2016/ink" xmlns:am3d="http://schemas.microsoft.com/office/drawing/2017/model3d" xmlns:o="urn:schemas-microsoft-com:office:office" xmlns:oel="http://schemas.microsoft.com/office/2019/extlst" xmlns:r="http://schemas.openxmlformats.org/officeDocument/2006/relationships" xmlns:m="http://schemas.openxmlformats.org/officeDocument/2006/math" xmlns:v="urn:schemas-microsoft-com:vml" xmlns:wp14="http://schemas.microsoft.com/office/word/2010/wordprocessingDrawing" xmlns:wp="http://schemas.openxmlformats.org/drawingml/2006/wordprocessingDrawing" xmlns:w10="urn:schemas-microsoft-com:office:word" xmlns:w="http://schemas.openxmlformats.org/wordprocessingml/2006/main" xmlns:w14="http://schemas.microsoft.com/office/word/2010/wordml" xmlns:w15="http://schemas.microsoft.com/office/word/2012/wordml" xmlns:w16cei="http://schemas.microsoft.com/office/word/2026/wordml/cei" xmlns:w16cex="http://schemas.microsoft.com/office/word/2018/wordml/cex" xmlns:w16cid="http://schemas.microsoft.com/office/word/2016/wordml/cid" xmlns:w16="http://schemas.microsoft.com/office/word/2018/wordml" xmlns:w16du="http://schemas.microsoft.com/office/word/2023/wordml/word16du" xmlns:w16sdtdh="http://schemas.microsoft.com/office/word/2020/wordml/sdtdatahash" xmlns:w16sdtfl="http://schemas.microsoft.com/office/word/2024/wordml/sdtformatlock" xmlns:w16se="http://schemas.microsoft.com/office/word/2015/wordml/symex" xmlns:wpg="http://schemas.microsoft.com/office/word/2010/wordprocessingGroup" xmlns:wpi="http://schemas.microsoft.com/office/word/2010/wordprocessingInk" xmlns:wne="http://schemas.microsoft.com/office/word/2006/wordml" xmlns:wps="http://schemas.microsoft.com/office/word/2010/wordprocessingShape" mc:Ignorable="w14 w15 w16se w16cid w16 w16cex w16sdtdh w16sdtfl w16du wp14">
   <w:p>
     <w:pPr>
       <w:pStyle w:val="Header"/>
@@ -1744,7 +1774,7 @@
 </file>
 
 <file path=word/numbering.xml><?xml version="1.0" encoding="utf-8"?>
-<w:numbering xmlns:wpc="http://schemas.microsoft.com/office/word/2010/wordprocessingCanvas" xmlns:cx="http://schemas.microsoft.com/office/drawing/2014/chartex" xmlns:cx1="http://schemas.microsoft.com/office/drawing/2015/9/8/chartex" xmlns:cx2="http://schemas.microsoft.com/office/drawing/2015/10/21/chartex" xmlns:cx3="http://schemas.microsoft.com/office/drawing/2016/5/9/chartex" xmlns:cx4="http://schemas.microsoft.com/office/drawing/2016/5/10/chartex" xmlns:cx5="http://schemas.microsoft.com/office/drawing/2016/5/11/chartex" xmlns:cx6="http://schemas.microsoft.com/office/drawing/2016/5/12/chartex" xmlns:cx7="http://schemas.microsoft.com/office/drawing/2016/5/13/chartex" xmlns:cx8="http://schemas.microsoft.com/office/drawing/2016/5/14/chartex" xmlns:mc="http://schemas.openxmlformats.org/markup-compatibility/2006" xmlns:aink="http://schemas.microsoft.com/office/drawing/2016/ink" xmlns:am3d="http://schemas.microsoft.com/office/drawing/2017/model3d" xmlns:o="urn:schemas-microsoft-com:office:office" xmlns:oel="http://schemas.microsoft.com/office/2019/extlst" xmlns:r="http://schemas.openxmlformats.org/officeDocument/2006/relationships" xmlns:m="http://schemas.openxmlformats.org/officeDocument/2006/math" xmlns:v="urn:schemas-microsoft-com:vml" xmlns:wp14="http://schemas.microsoft.com/office/word/2010/wordprocessingDrawing" xmlns:wp="http://schemas.openxmlformats.org/drawingml/2006/wordprocessingDrawing" xmlns:w10="urn:schemas-microsoft-com:office:word" xmlns:w="http://schemas.openxmlformats.org/wordprocessingml/2006/main" xmlns:w14="http://schemas.microsoft.com/office/word/2010/wordml" xmlns:w15="http://schemas.microsoft.com/office/word/2012/wordml" xmlns:w16cex="http://schemas.microsoft.com/office/word/2018/wordml/cex" xmlns:w16cid="http://schemas.microsoft.com/office/word/2016/wordml/cid" xmlns:w16="http://schemas.microsoft.com/office/word/2018/wordml" xmlns:w16du="http://schemas.microsoft.com/office/word/2023/wordml/word16du" xmlns:w16sdtdh="http://schemas.microsoft.com/office/word/2020/wordml/sdtdatahash" xmlns:w16sdtfl="http://schemas.microsoft.com/office/word/2024/wordml/sdtformatlock" xmlns:w16se="http://schemas.microsoft.com/office/word/2015/wordml/symex" xmlns:wpg="http://schemas.microsoft.com/office/word/2010/wordprocessingGroup" xmlns:wpi="http://schemas.microsoft.com/office/word/2010/wordprocessingInk" xmlns:wne="http://schemas.microsoft.com/office/word/2006/wordml" xmlns:wps="http://schemas.microsoft.com/office/word/2010/wordprocessingShape" mc:Ignorable="w14 w15 w16se w16cid w16 w16cex w16sdtdh w16sdtfl w16du wp14">
+<w:numbering xmlns:wpc="http://schemas.microsoft.com/office/word/2010/wordprocessingCanvas" xmlns:cx="http://schemas.microsoft.com/office/drawing/2014/chartex" xmlns:cx1="http://schemas.microsoft.com/office/drawing/2015/9/8/chartex" xmlns:cx2="http://schemas.microsoft.com/office/drawing/2015/10/21/chartex" xmlns:cx3="http://schemas.microsoft.com/office/drawing/2016/5/9/chartex" xmlns:cx4="http://schemas.microsoft.com/office/drawing/2016/5/10/chartex" xmlns:cx5="http://schemas.microsoft.com/office/drawing/2016/5/11/chartex" xmlns:cx6="http://schemas.microsoft.com/office/drawing/2016/5/12/chartex" xmlns:cx7="http://schemas.microsoft.com/office/drawing/2016/5/13/chartex" xmlns:cx8="http://schemas.microsoft.com/office/drawing/2016/5/14/chartex" xmlns:mc="http://schemas.openxmlformats.org/markup-compatibility/2006" xmlns:aink="http://schemas.microsoft.com/office/drawing/2016/ink" xmlns:am3d="http://schemas.microsoft.com/office/drawing/2017/model3d" xmlns:o="urn:schemas-microsoft-com:office:office" xmlns:oel="http://schemas.microsoft.com/office/2019/extlst" xmlns:r="http://schemas.openxmlformats.org/officeDocument/2006/relationships" xmlns:m="http://schemas.openxmlformats.org/officeDocument/2006/math" xmlns:v="urn:schemas-microsoft-com:vml" xmlns:wp14="http://schemas.microsoft.com/office/word/2010/wordprocessingDrawing" xmlns:wp="http://schemas.openxmlformats.org/drawingml/2006/wordprocessingDrawing" xmlns:w10="urn:schemas-microsoft-com:office:word" xmlns:w="http://schemas.openxmlformats.org/wordprocessingml/2006/main" xmlns:w14="http://schemas.microsoft.com/office/word/2010/wordml" xmlns:w15="http://schemas.microsoft.com/office/word/2012/wordml" xmlns:w16cei="http://schemas.microsoft.com/office/word/2026/wordml/cei" xmlns:w16cex="http://schemas.microsoft.com/office/word/2018/wordml/cex" xmlns:w16cid="http://schemas.microsoft.com/office/word/2016/wordml/cid" xmlns:w16="http://schemas.microsoft.com/office/word/2018/wordml" xmlns:w16du="http://schemas.microsoft.com/office/word/2023/wordml/word16du" xmlns:w16sdtdh="http://schemas.microsoft.com/office/word/2020/wordml/sdtdatahash" xmlns:w16sdtfl="http://schemas.microsoft.com/office/word/2024/wordml/sdtformatlock" xmlns:w16se="http://schemas.microsoft.com/office/word/2015/wordml/symex" xmlns:wpg="http://schemas.microsoft.com/office/word/2010/wordprocessingGroup" xmlns:wpi="http://schemas.microsoft.com/office/word/2010/wordprocessingInk" xmlns:wne="http://schemas.microsoft.com/office/word/2006/wordml" xmlns:wps="http://schemas.microsoft.com/office/word/2010/wordprocessingShape" mc:Ignorable="w14 w15 w16se w16cid w16 w16cex w16sdtdh w16sdtfl w16du wp14">
   <w:abstractNum w:abstractNumId="0" w15:restartNumberingAfterBreak="0">
     <w:nsid w:val="221B2FF2"/>
     <w:multiLevelType w:val="hybridMultilevel"/>

</xml_diff>